<commit_message>
feat(vitis): 新增 daq/src 源码并完善 .gitignore
1. 新增 vitis/daq/src/ 下的 C 源文件（main.c、platform*.c/h、echo.c）
2. 更新 .gitignore：排除 daq/src/ 中的非源码文件（Xilinx.spec、README.txt、lscript.ld）
3. 更新 DAQ 网络控制协议文档
</commit_message>
<xml_diff>
--- a/doc/DAQ网络控制协议.docx
+++ b/doc/DAQ网络控制协议.docx
@@ -834,11 +834,6 @@
             <w:insideH w:val="single" w:color="auto" w:sz="4" w:space="0"/>
             <w:insideV w:val="single" w:color="auto" w:sz="4" w:space="0"/>
           </w:tblBorders>
-          <w:shd w:val="clear" w:color="auto" w:fill="auto"/>
-          <w:tblCellMar>
-            <w:left w:w="108" w:type="dxa"/>
-            <w:right w:w="108" w:type="dxa"/>
-          </w:tblCellMar>
         </w:tblPrEx>
         <w:trPr>
           <w:trHeight w:val="0" w:hRule="atLeast"/>
@@ -916,7 +911,6 @@
             <w:insideH w:val="single" w:color="auto" w:sz="4" w:space="0"/>
             <w:insideV w:val="single" w:color="auto" w:sz="4" w:space="0"/>
           </w:tblBorders>
-          <w:shd w:val="clear" w:color="auto" w:fill="auto"/>
           <w:tblCellMar>
             <w:left w:w="108" w:type="dxa"/>
             <w:right w:w="108" w:type="dxa"/>
@@ -1286,7 +1280,6 @@
             <w:insideH w:val="single" w:color="auto" w:sz="4" w:space="0"/>
             <w:insideV w:val="single" w:color="auto" w:sz="4" w:space="0"/>
           </w:tblBorders>
-          <w:shd w:val="clear" w:color="auto" w:fill="auto"/>
           <w:tblCellMar>
             <w:left w:w="108" w:type="dxa"/>
             <w:right w:w="108" w:type="dxa"/>
@@ -1668,7 +1661,6 @@
             <w:insideH w:val="single" w:color="auto" w:sz="4" w:space="0"/>
             <w:insideV w:val="single" w:color="auto" w:sz="4" w:space="0"/>
           </w:tblBorders>
-          <w:shd w:val="clear" w:color="auto" w:fill="auto"/>
           <w:tblCellMar>
             <w:left w:w="108" w:type="dxa"/>
             <w:right w:w="108" w:type="dxa"/>
@@ -1989,7 +1981,51 @@
                 <w:sz w:val="22"/>
                 <w:u w:val="none"/>
               </w:rPr>
-              <w:t>0xXXXXXXXX</w:t>
+              <w:t>0</w:t>
+            </w:r>
+            <w:r>
+              <w:rPr>
+                <w:rFonts w:hint="eastAsia" w:cs="宋体"/>
+                <w:b w:val="0"/>
+                <w:i w:val="0"/>
+                <w:strike w:val="0"/>
+                <w:color w:val="000000"/>
+                <w:spacing w:val="0"/>
+                <w:kern w:val="2"/>
+                <w:sz w:val="22"/>
+                <w:u w:val="none"/>
+                <w:lang w:val="en-US" w:eastAsia="zh-CN"/>
+              </w:rPr>
+              <w:t>x</w:t>
+            </w:r>
+            <w:r>
+              <w:rPr>
+                <w:rFonts w:hint="eastAsia" w:cs="宋体"/>
+                <w:b w:val="0"/>
+                <w:i w:val="0"/>
+                <w:strike w:val="0"/>
+                <w:color w:val="000000"/>
+                <w:spacing w:val="0"/>
+                <w:kern w:val="2"/>
+                <w:sz w:val="22"/>
+                <w:u w:val="none"/>
+                <w:lang w:eastAsia="zh-CN"/>
+              </w:rPr>
+              <w:t>XXXXXXX</w:t>
+            </w:r>
+            <w:r>
+              <w:rPr>
+                <w:rFonts w:hint="eastAsia" w:ascii="Times New Roman" w:hAnsi="Times New Roman" w:eastAsia="宋体" w:cs="宋体"/>
+                <w:b w:val="0"/>
+                <w:i w:val="0"/>
+                <w:strike w:val="0"/>
+                <w:color w:val="000000"/>
+                <w:spacing w:val="0"/>
+                <w:kern w:val="2"/>
+                <w:sz w:val="22"/>
+                <w:u w:val="none"/>
+              </w:rPr>
+              <w:t>X</w:t>
             </w:r>
           </w:p>
         </w:tc>
@@ -2050,7 +2086,6 @@
             <w:insideH w:val="single" w:color="auto" w:sz="4" w:space="0"/>
             <w:insideV w:val="single" w:color="auto" w:sz="4" w:space="0"/>
           </w:tblBorders>
-          <w:shd w:val="clear" w:color="auto" w:fill="auto"/>
           <w:tblCellMar>
             <w:left w:w="108" w:type="dxa"/>
             <w:right w:w="108" w:type="dxa"/>
@@ -2508,7 +2543,6 @@
             <w:insideH w:val="single" w:color="auto" w:sz="4" w:space="0"/>
             <w:insideV w:val="single" w:color="auto" w:sz="4" w:space="0"/>
           </w:tblBorders>
-          <w:shd w:val="clear" w:color="auto" w:fill="auto"/>
           <w:tblCellMar>
             <w:left w:w="108" w:type="dxa"/>
             <w:right w:w="108" w:type="dxa"/>
@@ -2848,7 +2882,6 @@
             <w:insideH w:val="single" w:color="auto" w:sz="4" w:space="0"/>
             <w:insideV w:val="single" w:color="auto" w:sz="4" w:space="0"/>
           </w:tblBorders>
-          <w:shd w:val="clear" w:color="auto" w:fill="auto"/>
           <w:tblCellMar>
             <w:left w:w="108" w:type="dxa"/>
             <w:right w:w="108" w:type="dxa"/>
@@ -3451,6 +3484,8 @@
         </w:rPr>
         <w:t>数据类型</w:t>
       </w:r>
+      <w:bookmarkStart w:id="0" w:name="_GoBack"/>
+      <w:bookmarkEnd w:id="0"/>
     </w:p>
     <w:tbl>
       <w:tblPr>
@@ -3475,9 +3510,9 @@
       </w:tblPr>
       <w:tblGrid>
         <w:gridCol w:w="1174"/>
-        <w:gridCol w:w="2846"/>
-        <w:gridCol w:w="3129"/>
-        <w:gridCol w:w="1177"/>
+        <w:gridCol w:w="2114"/>
+        <w:gridCol w:w="1750"/>
+        <w:gridCol w:w="3288"/>
       </w:tblGrid>
       <w:tr>
         <w:tblPrEx>
@@ -3655,7 +3690,7 @@
         </w:tc>
         <w:tc>
           <w:tcPr>
-            <w:tcW w:w="0" w:type="auto"/>
+            <w:tcW w:w="2114" w:type="dxa"/>
             <w:tcBorders>
               <w:top w:val="single" w:color="7030A0" w:sz="6" w:space="0"/>
               <w:left w:val="single" w:color="C7A2E3" w:sz="6" w:space="0"/>
@@ -3719,7 +3754,7 @@
         </w:tc>
         <w:tc>
           <w:tcPr>
-            <w:tcW w:w="0" w:type="auto"/>
+            <w:tcW w:w="1750" w:type="dxa"/>
             <w:tcBorders>
               <w:top w:val="single" w:color="7030A0" w:sz="6" w:space="0"/>
               <w:left w:val="single" w:color="C7A2E3" w:sz="6" w:space="0"/>
@@ -3783,7 +3818,7 @@
         </w:tc>
         <w:tc>
           <w:tcPr>
-            <w:tcW w:w="1177" w:type="dxa"/>
+            <w:tcW w:w="3288" w:type="dxa"/>
             <w:tcBorders>
               <w:top w:val="single" w:color="7030A0" w:sz="6" w:space="0"/>
               <w:left w:val="single" w:color="C7A2E3" w:sz="6" w:space="0"/>
@@ -3914,7 +3949,6 @@
                 <w:lang w:eastAsia="zh-CN"/>
               </w:rPr>
             </w:pPr>
-            <w:bookmarkStart w:id="0" w:name="_GoBack" w:colFirst="3" w:colLast="3"/>
             <w:r>
               <w:rPr>
                 <w:rFonts w:hint="eastAsia" w:ascii="Times New Roman" w:hAnsi="Times New Roman" w:eastAsia="宋体" w:cs="宋体"/>
@@ -3934,7 +3968,7 @@
         </w:tc>
         <w:tc>
           <w:tcPr>
-            <w:tcW w:w="0" w:type="auto"/>
+            <w:tcW w:w="2114" w:type="dxa"/>
             <w:tcBorders>
               <w:top w:val="single" w:color="C7A2E3" w:sz="6" w:space="0"/>
               <w:left w:val="single" w:color="C7A2E3" w:sz="6" w:space="0"/>
@@ -3998,7 +4032,7 @@
         </w:tc>
         <w:tc>
           <w:tcPr>
-            <w:tcW w:w="0" w:type="auto"/>
+            <w:tcW w:w="1750" w:type="dxa"/>
             <w:tcBorders>
               <w:top w:val="single" w:color="C7A2E3" w:sz="6" w:space="0"/>
               <w:left w:val="single" w:color="C7A2E3" w:sz="6" w:space="0"/>
@@ -4031,7 +4065,7 @@
               <w:snapToGrid w:val="0"/>
               <w:spacing w:before="0" w:after="0" w:line="240" w:lineRule="auto"/>
               <w:ind w:left="0" w:leftChars="0" w:right="0" w:rightChars="0" w:firstLine="0" w:firstLineChars="0"/>
-              <w:jc w:val="left"/>
+              <w:jc w:val="center"/>
               <w:textAlignment w:val="auto"/>
               <w:rPr>
                 <w:rFonts w:ascii="Times New Roman" w:hAnsi="minorHAnsi" w:eastAsia="宋体" w:cs="Times New Roman"/>
@@ -4045,24 +4079,69 @@
             </w:pPr>
             <w:r>
               <w:rPr>
-                <w:rFonts w:hint="eastAsia" w:ascii="Times New Roman" w:hAnsi="Times New Roman" w:eastAsia="宋体" w:cs="宋体"/>
-                <w:b w:val="0"/>
-                <w:i w:val="0"/>
-                <w:strike w:val="0"/>
-                <w:color w:val="000000"/>
-                <w:spacing w:val="0"/>
-                <w:kern w:val="2"/>
-                <w:sz w:val="22"/>
-                <w:u w:val="none"/>
-                <w:lang/>
-              </w:rPr>
-              <w:t>OxC0xx00FF</w:t>
-            </w:r>
-          </w:p>
-        </w:tc>
-        <w:tc>
-          <w:tcPr>
-            <w:tcW w:w="1177" w:type="dxa"/>
+                <w:rFonts w:hint="eastAsia" w:cs="宋体"/>
+                <w:b w:val="0"/>
+                <w:i w:val="0"/>
+                <w:strike w:val="0"/>
+                <w:color w:val="000000"/>
+                <w:spacing w:val="0"/>
+                <w:kern w:val="2"/>
+                <w:sz w:val="22"/>
+                <w:u w:val="none"/>
+                <w:lang w:eastAsia="zh-CN"/>
+              </w:rPr>
+              <w:t>0x</w:t>
+            </w:r>
+            <w:r>
+              <w:rPr>
+                <w:rFonts w:hint="eastAsia" w:ascii="Times New Roman" w:hAnsi="Times New Roman" w:eastAsia="宋体" w:cs="宋体"/>
+                <w:b w:val="0"/>
+                <w:i w:val="0"/>
+                <w:strike w:val="0"/>
+                <w:color w:val="000000"/>
+                <w:spacing w:val="0"/>
+                <w:kern w:val="2"/>
+                <w:sz w:val="22"/>
+                <w:u w:val="none"/>
+                <w:lang/>
+              </w:rPr>
+              <w:t>C0</w:t>
+            </w:r>
+            <w:r>
+              <w:rPr>
+                <w:rFonts w:hint="eastAsia" w:cs="宋体"/>
+                <w:b w:val="0"/>
+                <w:i w:val="0"/>
+                <w:strike w:val="0"/>
+                <w:color w:val="000000"/>
+                <w:spacing w:val="0"/>
+                <w:kern w:val="2"/>
+                <w:sz w:val="22"/>
+                <w:u w:val="none"/>
+                <w:lang w:eastAsia="zh-CN"/>
+              </w:rPr>
+              <w:t>XX</w:t>
+            </w:r>
+            <w:r>
+              <w:rPr>
+                <w:rFonts w:hint="eastAsia" w:ascii="Times New Roman" w:hAnsi="Times New Roman" w:eastAsia="宋体" w:cs="宋体"/>
+                <w:b w:val="0"/>
+                <w:i w:val="0"/>
+                <w:strike w:val="0"/>
+                <w:color w:val="000000"/>
+                <w:spacing w:val="0"/>
+                <w:kern w:val="2"/>
+                <w:sz w:val="22"/>
+                <w:u w:val="none"/>
+                <w:lang/>
+              </w:rPr>
+              <w:t>00FF</w:t>
+            </w:r>
+          </w:p>
+        </w:tc>
+        <w:tc>
+          <w:tcPr>
+            <w:tcW w:w="3288" w:type="dxa"/>
             <w:tcBorders>
               <w:top w:val="single" w:color="C7A2E3" w:sz="6" w:space="0"/>
               <w:left w:val="single" w:color="C7A2E3" w:sz="6" w:space="0"/>
@@ -4197,7 +4276,7 @@
         </w:tc>
         <w:tc>
           <w:tcPr>
-            <w:tcW w:w="0" w:type="auto"/>
+            <w:tcW w:w="2114" w:type="dxa"/>
             <w:tcBorders>
               <w:top w:val="single" w:color="C7A2E3" w:sz="6" w:space="0"/>
               <w:left w:val="single" w:color="C7A2E3" w:sz="6" w:space="0"/>
@@ -4261,7 +4340,7 @@
         </w:tc>
         <w:tc>
           <w:tcPr>
-            <w:tcW w:w="0" w:type="auto"/>
+            <w:tcW w:w="1750" w:type="dxa"/>
             <w:tcBorders>
               <w:top w:val="single" w:color="C7A2E3" w:sz="6" w:space="0"/>
               <w:left w:val="single" w:color="C7A2E3" w:sz="6" w:space="0"/>
@@ -4294,7 +4373,7 @@
               <w:snapToGrid w:val="0"/>
               <w:spacing w:before="0" w:after="0" w:line="240" w:lineRule="auto"/>
               <w:ind w:left="0" w:leftChars="0" w:right="0" w:rightChars="0" w:firstLine="0" w:firstLineChars="0"/>
-              <w:jc w:val="left"/>
+              <w:jc w:val="center"/>
               <w:textAlignment w:val="auto"/>
               <w:rPr>
                 <w:rFonts w:ascii="Times New Roman" w:hAnsi="minorHAnsi" w:eastAsia="宋体" w:cs="Times New Roman"/>
@@ -4308,24 +4387,69 @@
             </w:pPr>
             <w:r>
               <w:rPr>
-                <w:rFonts w:hint="eastAsia" w:ascii="Times New Roman" w:hAnsi="Times New Roman" w:eastAsia="宋体" w:cs="宋体"/>
-                <w:b w:val="0"/>
-                <w:i w:val="0"/>
-                <w:strike w:val="0"/>
-                <w:color w:val="000000"/>
-                <w:spacing w:val="0"/>
-                <w:kern w:val="2"/>
-                <w:sz w:val="22"/>
-                <w:u w:val="none"/>
-                <w:lang/>
-              </w:rPr>
-              <w:t>OxC1xx00FF</w:t>
-            </w:r>
-          </w:p>
-        </w:tc>
-        <w:tc>
-          <w:tcPr>
-            <w:tcW w:w="1177" w:type="dxa"/>
+                <w:rFonts w:hint="eastAsia" w:cs="宋体"/>
+                <w:b w:val="0"/>
+                <w:i w:val="0"/>
+                <w:strike w:val="0"/>
+                <w:color w:val="000000"/>
+                <w:spacing w:val="0"/>
+                <w:kern w:val="2"/>
+                <w:sz w:val="22"/>
+                <w:u w:val="none"/>
+                <w:lang w:eastAsia="zh-CN"/>
+              </w:rPr>
+              <w:t>0x</w:t>
+            </w:r>
+            <w:r>
+              <w:rPr>
+                <w:rFonts w:hint="eastAsia" w:ascii="Times New Roman" w:hAnsi="Times New Roman" w:eastAsia="宋体" w:cs="宋体"/>
+                <w:b w:val="0"/>
+                <w:i w:val="0"/>
+                <w:strike w:val="0"/>
+                <w:color w:val="000000"/>
+                <w:spacing w:val="0"/>
+                <w:kern w:val="2"/>
+                <w:sz w:val="22"/>
+                <w:u w:val="none"/>
+                <w:lang/>
+              </w:rPr>
+              <w:t>C1</w:t>
+            </w:r>
+            <w:r>
+              <w:rPr>
+                <w:rFonts w:hint="eastAsia" w:cs="宋体"/>
+                <w:b w:val="0"/>
+                <w:i w:val="0"/>
+                <w:strike w:val="0"/>
+                <w:color w:val="000000"/>
+                <w:spacing w:val="0"/>
+                <w:kern w:val="2"/>
+                <w:sz w:val="22"/>
+                <w:u w:val="none"/>
+                <w:lang w:eastAsia="zh-CN"/>
+              </w:rPr>
+              <w:t>XX</w:t>
+            </w:r>
+            <w:r>
+              <w:rPr>
+                <w:rFonts w:hint="eastAsia" w:ascii="Times New Roman" w:hAnsi="Times New Roman" w:eastAsia="宋体" w:cs="宋体"/>
+                <w:b w:val="0"/>
+                <w:i w:val="0"/>
+                <w:strike w:val="0"/>
+                <w:color w:val="000000"/>
+                <w:spacing w:val="0"/>
+                <w:kern w:val="2"/>
+                <w:sz w:val="22"/>
+                <w:u w:val="none"/>
+                <w:lang/>
+              </w:rPr>
+              <w:t>00FF</w:t>
+            </w:r>
+          </w:p>
+        </w:tc>
+        <w:tc>
+          <w:tcPr>
+            <w:tcW w:w="3288" w:type="dxa"/>
             <w:tcBorders>
               <w:top w:val="single" w:color="C7A2E3" w:sz="6" w:space="0"/>
               <w:left w:val="single" w:color="C7A2E3" w:sz="6" w:space="0"/>
@@ -4460,7 +4584,7 @@
         </w:tc>
         <w:tc>
           <w:tcPr>
-            <w:tcW w:w="0" w:type="auto"/>
+            <w:tcW w:w="2114" w:type="dxa"/>
             <w:tcBorders>
               <w:top w:val="single" w:color="C7A2E3" w:sz="6" w:space="0"/>
               <w:left w:val="single" w:color="C7A2E3" w:sz="6" w:space="0"/>
@@ -4524,7 +4648,7 @@
         </w:tc>
         <w:tc>
           <w:tcPr>
-            <w:tcW w:w="0" w:type="auto"/>
+            <w:tcW w:w="1750" w:type="dxa"/>
             <w:tcBorders>
               <w:top w:val="single" w:color="C7A2E3" w:sz="6" w:space="0"/>
               <w:left w:val="single" w:color="C7A2E3" w:sz="6" w:space="0"/>
@@ -4557,7 +4681,7 @@
               <w:snapToGrid w:val="0"/>
               <w:spacing w:before="0" w:after="0" w:line="240" w:lineRule="auto"/>
               <w:ind w:left="0" w:leftChars="0" w:right="0" w:rightChars="0" w:firstLine="0" w:firstLineChars="0"/>
-              <w:jc w:val="left"/>
+              <w:jc w:val="center"/>
               <w:textAlignment w:val="auto"/>
               <w:rPr>
                 <w:rFonts w:ascii="Times New Roman" w:hAnsi="minorHAnsi" w:eastAsia="宋体" w:cs="Times New Roman"/>
@@ -4571,24 +4695,69 @@
             </w:pPr>
             <w:r>
               <w:rPr>
-                <w:rFonts w:hint="eastAsia" w:ascii="Times New Roman" w:hAnsi="Times New Roman" w:eastAsia="宋体" w:cs="宋体"/>
-                <w:b w:val="0"/>
-                <w:i w:val="0"/>
-                <w:strike w:val="0"/>
-                <w:color w:val="000000"/>
-                <w:spacing w:val="0"/>
-                <w:kern w:val="2"/>
-                <w:sz w:val="22"/>
-                <w:u w:val="none"/>
-                <w:lang/>
-              </w:rPr>
-              <w:t>OxC2xx00FF</w:t>
-            </w:r>
-          </w:p>
-        </w:tc>
-        <w:tc>
-          <w:tcPr>
-            <w:tcW w:w="1177" w:type="dxa"/>
+                <w:rFonts w:hint="eastAsia" w:cs="宋体"/>
+                <w:b w:val="0"/>
+                <w:i w:val="0"/>
+                <w:strike w:val="0"/>
+                <w:color w:val="000000"/>
+                <w:spacing w:val="0"/>
+                <w:kern w:val="2"/>
+                <w:sz w:val="22"/>
+                <w:u w:val="none"/>
+                <w:lang w:eastAsia="zh-CN"/>
+              </w:rPr>
+              <w:t>0x</w:t>
+            </w:r>
+            <w:r>
+              <w:rPr>
+                <w:rFonts w:hint="eastAsia" w:ascii="Times New Roman" w:hAnsi="Times New Roman" w:eastAsia="宋体" w:cs="宋体"/>
+                <w:b w:val="0"/>
+                <w:i w:val="0"/>
+                <w:strike w:val="0"/>
+                <w:color w:val="000000"/>
+                <w:spacing w:val="0"/>
+                <w:kern w:val="2"/>
+                <w:sz w:val="22"/>
+                <w:u w:val="none"/>
+                <w:lang/>
+              </w:rPr>
+              <w:t>C2</w:t>
+            </w:r>
+            <w:r>
+              <w:rPr>
+                <w:rFonts w:hint="eastAsia" w:cs="宋体"/>
+                <w:b w:val="0"/>
+                <w:i w:val="0"/>
+                <w:strike w:val="0"/>
+                <w:color w:val="000000"/>
+                <w:spacing w:val="0"/>
+                <w:kern w:val="2"/>
+                <w:sz w:val="22"/>
+                <w:u w:val="none"/>
+                <w:lang w:eastAsia="zh-CN"/>
+              </w:rPr>
+              <w:t>XX</w:t>
+            </w:r>
+            <w:r>
+              <w:rPr>
+                <w:rFonts w:hint="eastAsia" w:ascii="Times New Roman" w:hAnsi="Times New Roman" w:eastAsia="宋体" w:cs="宋体"/>
+                <w:b w:val="0"/>
+                <w:i w:val="0"/>
+                <w:strike w:val="0"/>
+                <w:color w:val="000000"/>
+                <w:spacing w:val="0"/>
+                <w:kern w:val="2"/>
+                <w:sz w:val="22"/>
+                <w:u w:val="none"/>
+                <w:lang/>
+              </w:rPr>
+              <w:t>00FF</w:t>
+            </w:r>
+          </w:p>
+        </w:tc>
+        <w:tc>
+          <w:tcPr>
+            <w:tcW w:w="3288" w:type="dxa"/>
             <w:tcBorders>
               <w:top w:val="single" w:color="C7A2E3" w:sz="6" w:space="0"/>
               <w:left w:val="single" w:color="C7A2E3" w:sz="6" w:space="0"/>
@@ -4723,7 +4892,7 @@
         </w:tc>
         <w:tc>
           <w:tcPr>
-            <w:tcW w:w="0" w:type="auto"/>
+            <w:tcW w:w="2114" w:type="dxa"/>
             <w:tcBorders>
               <w:top w:val="single" w:color="C7A2E3" w:sz="6" w:space="0"/>
               <w:left w:val="single" w:color="C7A2E3" w:sz="6" w:space="0"/>
@@ -4787,7 +4956,7 @@
         </w:tc>
         <w:tc>
           <w:tcPr>
-            <w:tcW w:w="0" w:type="auto"/>
+            <w:tcW w:w="1750" w:type="dxa"/>
             <w:tcBorders>
               <w:top w:val="single" w:color="C7A2E3" w:sz="6" w:space="0"/>
               <w:left w:val="single" w:color="C7A2E3" w:sz="6" w:space="0"/>
@@ -4820,7 +4989,7 @@
               <w:snapToGrid w:val="0"/>
               <w:spacing w:before="0" w:after="0" w:line="240" w:lineRule="auto"/>
               <w:ind w:left="0" w:leftChars="0" w:right="0" w:rightChars="0" w:firstLine="0" w:firstLineChars="0"/>
-              <w:jc w:val="left"/>
+              <w:jc w:val="center"/>
               <w:textAlignment w:val="auto"/>
               <w:rPr>
                 <w:rFonts w:ascii="Times New Roman" w:hAnsi="minorHAnsi" w:eastAsia="宋体" w:cs="Times New Roman"/>
@@ -4834,24 +5003,69 @@
             </w:pPr>
             <w:r>
               <w:rPr>
-                <w:rFonts w:hint="eastAsia" w:ascii="Times New Roman" w:hAnsi="Times New Roman" w:eastAsia="宋体" w:cs="宋体"/>
-                <w:b w:val="0"/>
-                <w:i w:val="0"/>
-                <w:strike w:val="0"/>
-                <w:color w:val="000000"/>
-                <w:spacing w:val="0"/>
-                <w:kern w:val="2"/>
-                <w:sz w:val="22"/>
-                <w:u w:val="none"/>
-                <w:lang/>
-              </w:rPr>
-              <w:t>OxC3xx00FF</w:t>
-            </w:r>
-          </w:p>
-        </w:tc>
-        <w:tc>
-          <w:tcPr>
-            <w:tcW w:w="1177" w:type="dxa"/>
+                <w:rFonts w:hint="eastAsia" w:cs="宋体"/>
+                <w:b w:val="0"/>
+                <w:i w:val="0"/>
+                <w:strike w:val="0"/>
+                <w:color w:val="000000"/>
+                <w:spacing w:val="0"/>
+                <w:kern w:val="2"/>
+                <w:sz w:val="22"/>
+                <w:u w:val="none"/>
+                <w:lang w:eastAsia="zh-CN"/>
+              </w:rPr>
+              <w:t>0x</w:t>
+            </w:r>
+            <w:r>
+              <w:rPr>
+                <w:rFonts w:hint="eastAsia" w:ascii="Times New Roman" w:hAnsi="Times New Roman" w:eastAsia="宋体" w:cs="宋体"/>
+                <w:b w:val="0"/>
+                <w:i w:val="0"/>
+                <w:strike w:val="0"/>
+                <w:color w:val="000000"/>
+                <w:spacing w:val="0"/>
+                <w:kern w:val="2"/>
+                <w:sz w:val="22"/>
+                <w:u w:val="none"/>
+                <w:lang/>
+              </w:rPr>
+              <w:t>C3</w:t>
+            </w:r>
+            <w:r>
+              <w:rPr>
+                <w:rFonts w:hint="eastAsia" w:cs="宋体"/>
+                <w:b w:val="0"/>
+                <w:i w:val="0"/>
+                <w:strike w:val="0"/>
+                <w:color w:val="000000"/>
+                <w:spacing w:val="0"/>
+                <w:kern w:val="2"/>
+                <w:sz w:val="22"/>
+                <w:u w:val="none"/>
+                <w:lang w:eastAsia="zh-CN"/>
+              </w:rPr>
+              <w:t>XX</w:t>
+            </w:r>
+            <w:r>
+              <w:rPr>
+                <w:rFonts w:hint="eastAsia" w:ascii="Times New Roman" w:hAnsi="Times New Roman" w:eastAsia="宋体" w:cs="宋体"/>
+                <w:b w:val="0"/>
+                <w:i w:val="0"/>
+                <w:strike w:val="0"/>
+                <w:color w:val="000000"/>
+                <w:spacing w:val="0"/>
+                <w:kern w:val="2"/>
+                <w:sz w:val="22"/>
+                <w:u w:val="none"/>
+                <w:lang/>
+              </w:rPr>
+              <w:t>00FF</w:t>
+            </w:r>
+          </w:p>
+        </w:tc>
+        <w:tc>
+          <w:tcPr>
+            <w:tcW w:w="3288" w:type="dxa"/>
             <w:tcBorders>
               <w:top w:val="single" w:color="C7A2E3" w:sz="6" w:space="0"/>
               <w:left w:val="single" w:color="C7A2E3" w:sz="6" w:space="0"/>
@@ -4986,7 +5200,7 @@
         </w:tc>
         <w:tc>
           <w:tcPr>
-            <w:tcW w:w="0" w:type="auto"/>
+            <w:tcW w:w="2114" w:type="dxa"/>
             <w:tcBorders>
               <w:top w:val="single" w:color="C7A2E3" w:sz="6" w:space="0"/>
               <w:left w:val="single" w:color="C7A2E3" w:sz="6" w:space="0"/>
@@ -5050,7 +5264,7 @@
         </w:tc>
         <w:tc>
           <w:tcPr>
-            <w:tcW w:w="0" w:type="auto"/>
+            <w:tcW w:w="1750" w:type="dxa"/>
             <w:tcBorders>
               <w:top w:val="single" w:color="C7A2E3" w:sz="6" w:space="0"/>
               <w:left w:val="single" w:color="C7A2E3" w:sz="6" w:space="0"/>
@@ -5083,7 +5297,7 @@
               <w:snapToGrid w:val="0"/>
               <w:spacing w:before="0" w:after="0" w:line="240" w:lineRule="auto"/>
               <w:ind w:left="0" w:leftChars="0" w:right="0" w:rightChars="0" w:firstLine="0" w:firstLineChars="0"/>
-              <w:jc w:val="left"/>
+              <w:jc w:val="center"/>
               <w:textAlignment w:val="auto"/>
               <w:rPr>
                 <w:rFonts w:ascii="Times New Roman" w:hAnsi="minorHAnsi" w:eastAsia="宋体" w:cs="Times New Roman"/>
@@ -5097,24 +5311,69 @@
             </w:pPr>
             <w:r>
               <w:rPr>
-                <w:rFonts w:hint="eastAsia" w:ascii="Times New Roman" w:hAnsi="Times New Roman" w:eastAsia="宋体" w:cs="宋体"/>
-                <w:b w:val="0"/>
-                <w:i w:val="0"/>
-                <w:strike w:val="0"/>
-                <w:color w:val="000000"/>
-                <w:spacing w:val="0"/>
-                <w:kern w:val="2"/>
-                <w:sz w:val="22"/>
-                <w:u w:val="none"/>
-                <w:lang/>
-              </w:rPr>
-              <w:t>OxC4xx00FF</w:t>
-            </w:r>
-          </w:p>
-        </w:tc>
-        <w:tc>
-          <w:tcPr>
-            <w:tcW w:w="1177" w:type="dxa"/>
+                <w:rFonts w:hint="eastAsia" w:cs="宋体"/>
+                <w:b w:val="0"/>
+                <w:i w:val="0"/>
+                <w:strike w:val="0"/>
+                <w:color w:val="000000"/>
+                <w:spacing w:val="0"/>
+                <w:kern w:val="2"/>
+                <w:sz w:val="22"/>
+                <w:u w:val="none"/>
+                <w:lang w:eastAsia="zh-CN"/>
+              </w:rPr>
+              <w:t>0x</w:t>
+            </w:r>
+            <w:r>
+              <w:rPr>
+                <w:rFonts w:hint="eastAsia" w:ascii="Times New Roman" w:hAnsi="Times New Roman" w:eastAsia="宋体" w:cs="宋体"/>
+                <w:b w:val="0"/>
+                <w:i w:val="0"/>
+                <w:strike w:val="0"/>
+                <w:color w:val="000000"/>
+                <w:spacing w:val="0"/>
+                <w:kern w:val="2"/>
+                <w:sz w:val="22"/>
+                <w:u w:val="none"/>
+                <w:lang/>
+              </w:rPr>
+              <w:t>C4</w:t>
+            </w:r>
+            <w:r>
+              <w:rPr>
+                <w:rFonts w:hint="eastAsia" w:cs="宋体"/>
+                <w:b w:val="0"/>
+                <w:i w:val="0"/>
+                <w:strike w:val="0"/>
+                <w:color w:val="000000"/>
+                <w:spacing w:val="0"/>
+                <w:kern w:val="2"/>
+                <w:sz w:val="22"/>
+                <w:u w:val="none"/>
+                <w:lang w:eastAsia="zh-CN"/>
+              </w:rPr>
+              <w:t>XX</w:t>
+            </w:r>
+            <w:r>
+              <w:rPr>
+                <w:rFonts w:hint="eastAsia" w:ascii="Times New Roman" w:hAnsi="Times New Roman" w:eastAsia="宋体" w:cs="宋体"/>
+                <w:b w:val="0"/>
+                <w:i w:val="0"/>
+                <w:strike w:val="0"/>
+                <w:color w:val="000000"/>
+                <w:spacing w:val="0"/>
+                <w:kern w:val="2"/>
+                <w:sz w:val="22"/>
+                <w:u w:val="none"/>
+                <w:lang/>
+              </w:rPr>
+              <w:t>00FF</w:t>
+            </w:r>
+          </w:p>
+        </w:tc>
+        <w:tc>
+          <w:tcPr>
+            <w:tcW w:w="3288" w:type="dxa"/>
             <w:tcBorders>
               <w:top w:val="single" w:color="C7A2E3" w:sz="6" w:space="0"/>
               <w:left w:val="single" w:color="C7A2E3" w:sz="6" w:space="0"/>
@@ -5249,7 +5508,7 @@
         </w:tc>
         <w:tc>
           <w:tcPr>
-            <w:tcW w:w="0" w:type="auto"/>
+            <w:tcW w:w="2114" w:type="dxa"/>
             <w:tcBorders>
               <w:top w:val="single" w:color="C7A2E3" w:sz="6" w:space="0"/>
               <w:left w:val="single" w:color="C7A2E3" w:sz="6" w:space="0"/>
@@ -5313,7 +5572,7 @@
         </w:tc>
         <w:tc>
           <w:tcPr>
-            <w:tcW w:w="0" w:type="auto"/>
+            <w:tcW w:w="1750" w:type="dxa"/>
             <w:tcBorders>
               <w:top w:val="single" w:color="C7A2E3" w:sz="6" w:space="0"/>
               <w:left w:val="single" w:color="C7A2E3" w:sz="6" w:space="0"/>
@@ -5346,7 +5605,7 @@
               <w:snapToGrid w:val="0"/>
               <w:spacing w:before="0" w:after="0" w:line="240" w:lineRule="auto"/>
               <w:ind w:left="0" w:leftChars="0" w:right="0" w:rightChars="0" w:firstLine="0" w:firstLineChars="0"/>
-              <w:jc w:val="left"/>
+              <w:jc w:val="center"/>
               <w:textAlignment w:val="auto"/>
               <w:rPr>
                 <w:rFonts w:ascii="Times New Roman" w:hAnsi="minorHAnsi" w:eastAsia="宋体" w:cs="Times New Roman"/>
@@ -5360,24 +5619,69 @@
             </w:pPr>
             <w:r>
               <w:rPr>
-                <w:rFonts w:hint="eastAsia" w:ascii="Times New Roman" w:hAnsi="Times New Roman" w:eastAsia="宋体" w:cs="宋体"/>
-                <w:b w:val="0"/>
-                <w:i w:val="0"/>
-                <w:strike w:val="0"/>
-                <w:color w:val="000000"/>
-                <w:spacing w:val="0"/>
-                <w:kern w:val="2"/>
-                <w:sz w:val="22"/>
-                <w:u w:val="none"/>
-                <w:lang/>
-              </w:rPr>
-              <w:t>OxC5xx00FF</w:t>
-            </w:r>
-          </w:p>
-        </w:tc>
-        <w:tc>
-          <w:tcPr>
-            <w:tcW w:w="1177" w:type="dxa"/>
+                <w:rFonts w:hint="eastAsia" w:cs="宋体"/>
+                <w:b w:val="0"/>
+                <w:i w:val="0"/>
+                <w:strike w:val="0"/>
+                <w:color w:val="000000"/>
+                <w:spacing w:val="0"/>
+                <w:kern w:val="2"/>
+                <w:sz w:val="22"/>
+                <w:u w:val="none"/>
+                <w:lang w:eastAsia="zh-CN"/>
+              </w:rPr>
+              <w:t>0x</w:t>
+            </w:r>
+            <w:r>
+              <w:rPr>
+                <w:rFonts w:hint="eastAsia" w:ascii="Times New Roman" w:hAnsi="Times New Roman" w:eastAsia="宋体" w:cs="宋体"/>
+                <w:b w:val="0"/>
+                <w:i w:val="0"/>
+                <w:strike w:val="0"/>
+                <w:color w:val="000000"/>
+                <w:spacing w:val="0"/>
+                <w:kern w:val="2"/>
+                <w:sz w:val="22"/>
+                <w:u w:val="none"/>
+                <w:lang/>
+              </w:rPr>
+              <w:t>C5</w:t>
+            </w:r>
+            <w:r>
+              <w:rPr>
+                <w:rFonts w:hint="eastAsia" w:cs="宋体"/>
+                <w:b w:val="0"/>
+                <w:i w:val="0"/>
+                <w:strike w:val="0"/>
+                <w:color w:val="000000"/>
+                <w:spacing w:val="0"/>
+                <w:kern w:val="2"/>
+                <w:sz w:val="22"/>
+                <w:u w:val="none"/>
+                <w:lang w:eastAsia="zh-CN"/>
+              </w:rPr>
+              <w:t>XX</w:t>
+            </w:r>
+            <w:r>
+              <w:rPr>
+                <w:rFonts w:hint="eastAsia" w:ascii="Times New Roman" w:hAnsi="Times New Roman" w:eastAsia="宋体" w:cs="宋体"/>
+                <w:b w:val="0"/>
+                <w:i w:val="0"/>
+                <w:strike w:val="0"/>
+                <w:color w:val="000000"/>
+                <w:spacing w:val="0"/>
+                <w:kern w:val="2"/>
+                <w:sz w:val="22"/>
+                <w:u w:val="none"/>
+                <w:lang/>
+              </w:rPr>
+              <w:t>00FF</w:t>
+            </w:r>
+          </w:p>
+        </w:tc>
+        <w:tc>
+          <w:tcPr>
+            <w:tcW w:w="3288" w:type="dxa"/>
             <w:tcBorders>
               <w:top w:val="single" w:color="C7A2E3" w:sz="6" w:space="0"/>
               <w:left w:val="single" w:color="C7A2E3" w:sz="6" w:space="0"/>
@@ -5512,7 +5816,7 @@
         </w:tc>
         <w:tc>
           <w:tcPr>
-            <w:tcW w:w="0" w:type="auto"/>
+            <w:tcW w:w="2114" w:type="dxa"/>
             <w:tcBorders>
               <w:top w:val="single" w:color="C7A2E3" w:sz="6" w:space="0"/>
               <w:left w:val="single" w:color="C7A2E3" w:sz="6" w:space="0"/>
@@ -5576,7 +5880,7 @@
         </w:tc>
         <w:tc>
           <w:tcPr>
-            <w:tcW w:w="0" w:type="auto"/>
+            <w:tcW w:w="1750" w:type="dxa"/>
             <w:tcBorders>
               <w:top w:val="single" w:color="C7A2E3" w:sz="6" w:space="0"/>
               <w:left w:val="single" w:color="C7A2E3" w:sz="6" w:space="0"/>
@@ -5609,7 +5913,7 @@
               <w:snapToGrid w:val="0"/>
               <w:spacing w:before="0" w:after="0" w:line="240" w:lineRule="auto"/>
               <w:ind w:left="0" w:leftChars="0" w:right="0" w:rightChars="0" w:firstLine="0" w:firstLineChars="0"/>
-              <w:jc w:val="left"/>
+              <w:jc w:val="center"/>
               <w:textAlignment w:val="auto"/>
               <w:rPr>
                 <w:rFonts w:ascii="Times New Roman" w:hAnsi="minorHAnsi" w:eastAsia="宋体" w:cs="Times New Roman"/>
@@ -5634,13 +5938,43 @@
                 <w:u w:val="none"/>
                 <w:lang/>
               </w:rPr>
-              <w:t>0xD0xx00FF</w:t>
-            </w:r>
-          </w:p>
-        </w:tc>
-        <w:tc>
-          <w:tcPr>
-            <w:tcW w:w="1177" w:type="dxa"/>
+              <w:t>0xD0</w:t>
+            </w:r>
+            <w:r>
+              <w:rPr>
+                <w:rFonts w:hint="eastAsia" w:cs="宋体"/>
+                <w:b w:val="0"/>
+                <w:i w:val="0"/>
+                <w:strike w:val="0"/>
+                <w:color w:val="000000"/>
+                <w:spacing w:val="0"/>
+                <w:kern w:val="2"/>
+                <w:sz w:val="22"/>
+                <w:u w:val="none"/>
+                <w:lang w:eastAsia="zh-CN"/>
+              </w:rPr>
+              <w:t>XX</w:t>
+            </w:r>
+            <w:r>
+              <w:rPr>
+                <w:rFonts w:hint="eastAsia" w:ascii="Times New Roman" w:hAnsi="Times New Roman" w:eastAsia="宋体" w:cs="宋体"/>
+                <w:b w:val="0"/>
+                <w:i w:val="0"/>
+                <w:strike w:val="0"/>
+                <w:color w:val="000000"/>
+                <w:spacing w:val="0"/>
+                <w:kern w:val="2"/>
+                <w:sz w:val="22"/>
+                <w:u w:val="none"/>
+                <w:lang/>
+              </w:rPr>
+              <w:t>00FF</w:t>
+            </w:r>
+          </w:p>
+        </w:tc>
+        <w:tc>
+          <w:tcPr>
+            <w:tcW w:w="3288" w:type="dxa"/>
             <w:tcBorders>
               <w:top w:val="single" w:color="C7A2E3" w:sz="6" w:space="0"/>
               <w:left w:val="single" w:color="C7A2E3" w:sz="6" w:space="0"/>
@@ -5775,7 +6109,7 @@
         </w:tc>
         <w:tc>
           <w:tcPr>
-            <w:tcW w:w="0" w:type="auto"/>
+            <w:tcW w:w="2114" w:type="dxa"/>
             <w:tcBorders>
               <w:top w:val="single" w:color="C7A2E3" w:sz="6" w:space="0"/>
               <w:left w:val="single" w:color="C7A2E3" w:sz="6" w:space="0"/>
@@ -5839,7 +6173,7 @@
         </w:tc>
         <w:tc>
           <w:tcPr>
-            <w:tcW w:w="0" w:type="auto"/>
+            <w:tcW w:w="1750" w:type="dxa"/>
             <w:tcBorders>
               <w:top w:val="single" w:color="C7A2E3" w:sz="6" w:space="0"/>
               <w:left w:val="single" w:color="C7A2E3" w:sz="6" w:space="0"/>
@@ -5872,7 +6206,7 @@
               <w:snapToGrid w:val="0"/>
               <w:spacing w:before="0" w:after="0" w:line="240" w:lineRule="auto"/>
               <w:ind w:left="0" w:leftChars="0" w:right="0" w:rightChars="0" w:firstLine="0" w:firstLineChars="0"/>
-              <w:jc w:val="left"/>
+              <w:jc w:val="center"/>
               <w:textAlignment w:val="auto"/>
               <w:rPr>
                 <w:rFonts w:ascii="Times New Roman" w:hAnsi="minorHAnsi" w:eastAsia="宋体" w:cs="Times New Roman"/>
@@ -5897,13 +6231,43 @@
                 <w:u w:val="none"/>
                 <w:lang/>
               </w:rPr>
-              <w:t>0xF0xx00FF</w:t>
-            </w:r>
-          </w:p>
-        </w:tc>
-        <w:tc>
-          <w:tcPr>
-            <w:tcW w:w="1177" w:type="dxa"/>
+              <w:t>0xF0</w:t>
+            </w:r>
+            <w:r>
+              <w:rPr>
+                <w:rFonts w:hint="eastAsia" w:cs="宋体"/>
+                <w:b w:val="0"/>
+                <w:i w:val="0"/>
+                <w:strike w:val="0"/>
+                <w:color w:val="000000"/>
+                <w:spacing w:val="0"/>
+                <w:kern w:val="2"/>
+                <w:sz w:val="22"/>
+                <w:u w:val="none"/>
+                <w:lang w:eastAsia="zh-CN"/>
+              </w:rPr>
+              <w:t>XX</w:t>
+            </w:r>
+            <w:r>
+              <w:rPr>
+                <w:rFonts w:hint="eastAsia" w:ascii="Times New Roman" w:hAnsi="Times New Roman" w:eastAsia="宋体" w:cs="宋体"/>
+                <w:b w:val="0"/>
+                <w:i w:val="0"/>
+                <w:strike w:val="0"/>
+                <w:color w:val="000000"/>
+                <w:spacing w:val="0"/>
+                <w:kern w:val="2"/>
+                <w:sz w:val="22"/>
+                <w:u w:val="none"/>
+                <w:lang/>
+              </w:rPr>
+              <w:t>00FF</w:t>
+            </w:r>
+          </w:p>
+        </w:tc>
+        <w:tc>
+          <w:tcPr>
+            <w:tcW w:w="3288" w:type="dxa"/>
             <w:tcBorders>
               <w:top w:val="single" w:color="C7A2E3" w:sz="6" w:space="0"/>
               <w:left w:val="single" w:color="C7A2E3" w:sz="6" w:space="0"/>
@@ -6038,7 +6402,7 @@
         </w:tc>
         <w:tc>
           <w:tcPr>
-            <w:tcW w:w="0" w:type="auto"/>
+            <w:tcW w:w="2114" w:type="dxa"/>
             <w:tcBorders>
               <w:top w:val="single" w:color="C7A2E3" w:sz="6" w:space="0"/>
               <w:left w:val="single" w:color="C7A2E3" w:sz="6" w:space="0"/>
@@ -6102,7 +6466,7 @@
         </w:tc>
         <w:tc>
           <w:tcPr>
-            <w:tcW w:w="0" w:type="auto"/>
+            <w:tcW w:w="1750" w:type="dxa"/>
             <w:tcBorders>
               <w:top w:val="single" w:color="C7A2E3" w:sz="6" w:space="0"/>
               <w:left w:val="single" w:color="C7A2E3" w:sz="6" w:space="0"/>
@@ -6135,7 +6499,7 @@
               <w:snapToGrid w:val="0"/>
               <w:spacing w:before="0" w:after="0" w:line="240" w:lineRule="auto"/>
               <w:ind w:left="0" w:leftChars="0" w:right="0" w:rightChars="0" w:firstLine="0" w:firstLineChars="0"/>
-              <w:jc w:val="left"/>
+              <w:jc w:val="center"/>
               <w:textAlignment w:val="auto"/>
               <w:rPr>
                 <w:rFonts w:ascii="Times New Roman" w:hAnsi="minorHAnsi" w:eastAsia="宋体" w:cs="Times New Roman"/>
@@ -6160,13 +6524,43 @@
                 <w:u w:val="none"/>
                 <w:lang/>
               </w:rPr>
-              <w:t>0xF1xx00FF</w:t>
-            </w:r>
-          </w:p>
-        </w:tc>
-        <w:tc>
-          <w:tcPr>
-            <w:tcW w:w="1177" w:type="dxa"/>
+              <w:t>0xF1</w:t>
+            </w:r>
+            <w:r>
+              <w:rPr>
+                <w:rFonts w:hint="eastAsia" w:cs="宋体"/>
+                <w:b w:val="0"/>
+                <w:i w:val="0"/>
+                <w:strike w:val="0"/>
+                <w:color w:val="000000"/>
+                <w:spacing w:val="0"/>
+                <w:kern w:val="2"/>
+                <w:sz w:val="22"/>
+                <w:u w:val="none"/>
+                <w:lang w:eastAsia="zh-CN"/>
+              </w:rPr>
+              <w:t>XX</w:t>
+            </w:r>
+            <w:r>
+              <w:rPr>
+                <w:rFonts w:hint="eastAsia" w:ascii="Times New Roman" w:hAnsi="Times New Roman" w:eastAsia="宋体" w:cs="宋体"/>
+                <w:b w:val="0"/>
+                <w:i w:val="0"/>
+                <w:strike w:val="0"/>
+                <w:color w:val="000000"/>
+                <w:spacing w:val="0"/>
+                <w:kern w:val="2"/>
+                <w:sz w:val="22"/>
+                <w:u w:val="none"/>
+                <w:lang/>
+              </w:rPr>
+              <w:t>00FF</w:t>
+            </w:r>
+          </w:p>
+        </w:tc>
+        <w:tc>
+          <w:tcPr>
+            <w:tcW w:w="3288" w:type="dxa"/>
             <w:tcBorders>
               <w:top w:val="single" w:color="C7A2E3" w:sz="6" w:space="0"/>
               <w:left w:val="single" w:color="C7A2E3" w:sz="6" w:space="0"/>
@@ -6301,7 +6695,7 @@
         </w:tc>
         <w:tc>
           <w:tcPr>
-            <w:tcW w:w="2846" w:type="dxa"/>
+            <w:tcW w:w="2114" w:type="dxa"/>
             <w:tcBorders>
               <w:top w:val="single" w:color="C7A2E3" w:sz="6" w:space="0"/>
               <w:left w:val="single" w:color="C7A2E3" w:sz="6" w:space="0"/>
@@ -6365,7 +6759,7 @@
         </w:tc>
         <w:tc>
           <w:tcPr>
-            <w:tcW w:w="3129" w:type="dxa"/>
+            <w:tcW w:w="1750" w:type="dxa"/>
             <w:tcBorders>
               <w:top w:val="single" w:color="C7A2E3" w:sz="6" w:space="0"/>
               <w:left w:val="single" w:color="C7A2E3" w:sz="6" w:space="0"/>
@@ -6398,7 +6792,7 @@
               <w:snapToGrid w:val="0"/>
               <w:spacing w:before="0" w:after="0" w:line="240" w:lineRule="auto"/>
               <w:ind w:left="0" w:leftChars="0" w:right="0" w:rightChars="0" w:firstLine="0" w:firstLineChars="0"/>
-              <w:jc w:val="left"/>
+              <w:jc w:val="center"/>
               <w:textAlignment w:val="auto"/>
               <w:rPr>
                 <w:rFonts w:ascii="Times New Roman" w:hAnsi="minorHAnsi" w:eastAsia="宋体" w:cs="Times New Roman"/>
@@ -6423,13 +6817,43 @@
                 <w:u w:val="none"/>
                 <w:lang/>
               </w:rPr>
-              <w:t>0xF2xx00FF</w:t>
-            </w:r>
-          </w:p>
-        </w:tc>
-        <w:tc>
-          <w:tcPr>
-            <w:tcW w:w="1177" w:type="dxa"/>
+              <w:t>0xF2</w:t>
+            </w:r>
+            <w:r>
+              <w:rPr>
+                <w:rFonts w:hint="eastAsia" w:cs="宋体"/>
+                <w:b w:val="0"/>
+                <w:i w:val="0"/>
+                <w:strike w:val="0"/>
+                <w:color w:val="000000"/>
+                <w:spacing w:val="0"/>
+                <w:kern w:val="2"/>
+                <w:sz w:val="22"/>
+                <w:u w:val="none"/>
+                <w:lang w:eastAsia="zh-CN"/>
+              </w:rPr>
+              <w:t>XX</w:t>
+            </w:r>
+            <w:r>
+              <w:rPr>
+                <w:rFonts w:hint="eastAsia" w:ascii="Times New Roman" w:hAnsi="Times New Roman" w:eastAsia="宋体" w:cs="宋体"/>
+                <w:b w:val="0"/>
+                <w:i w:val="0"/>
+                <w:strike w:val="0"/>
+                <w:color w:val="000000"/>
+                <w:spacing w:val="0"/>
+                <w:kern w:val="2"/>
+                <w:sz w:val="22"/>
+                <w:u w:val="none"/>
+                <w:lang/>
+              </w:rPr>
+              <w:t>00FF</w:t>
+            </w:r>
+          </w:p>
+        </w:tc>
+        <w:tc>
+          <w:tcPr>
+            <w:tcW w:w="3288" w:type="dxa"/>
             <w:tcBorders>
               <w:top w:val="single" w:color="C7A2E3" w:sz="6" w:space="0"/>
               <w:left w:val="single" w:color="C7A2E3" w:sz="6" w:space="0"/>
@@ -6477,7 +6901,6 @@
           </w:p>
         </w:tc>
       </w:tr>
-      <w:bookmarkEnd w:id="0"/>
     </w:tbl>
     <w:p/>
     <w:p/>

</xml_diff>